<commit_message>
add: docusogn logic and properties nyuukai todoke, fix needed
</commit_message>
<xml_diff>
--- a/backend/src/main/resources/templates/participate_solar.docx
+++ b/backend/src/main/resources/templates/participate_solar.docx
@@ -1,6 +1,6 @@
 
 <file path=word/document.xml><?xml version="1.0" encoding="utf-8"?>
-<w:document xmlns:wpc="http://schemas.microsoft.com/office/word/2010/wordprocessingCanvas" xmlns:cx="http://schemas.microsoft.com/office/drawing/2014/chartex" xmlns:cx1="http://schemas.microsoft.com/office/drawing/2015/9/8/chartex" xmlns:cx2="http://schemas.microsoft.com/office/drawing/2015/10/21/chartex" xmlns:cx3="http://schemas.microsoft.com/office/drawing/2016/5/9/chartex" xmlns:cx4="http://schemas.microsoft.com/office/drawing/2016/5/10/chartex" xmlns:cx5="http://schemas.microsoft.com/office/drawing/2016/5/11/chartex" xmlns:cx6="http://schemas.microsoft.com/office/drawing/2016/5/12/chartex" xmlns:cx7="http://schemas.microsoft.com/office/drawing/2016/5/13/chartex" xmlns:cx8="http://schemas.microsoft.com/office/drawing/2016/5/14/chartex" xmlns:mc="http://schemas.openxmlformats.org/markup-compatibility/2006" xmlns:aink="http://schemas.microsoft.com/office/drawing/2016/ink" xmlns:am3d="http://schemas.microsoft.com/office/drawing/2017/model3d" xmlns:o="urn:schemas-microsoft-com:office:office" xmlns:oel="http://schemas.microsoft.com/office/2019/extlst" xmlns:r="http://schemas.openxmlformats.org/officeDocument/2006/relationships" xmlns:m="http://schemas.openxmlformats.org/officeDocument/2006/math" xmlns:v="urn:schemas-microsoft-com:vml" xmlns:wp14="http://schemas.microsoft.com/office/word/2010/wordprocessingDrawing" xmlns:wp="http://schemas.openxmlformats.org/drawingml/2006/wordprocessingDrawing" xmlns:w10="urn:schemas-microsoft-com:office:word" xmlns:w="http://schemas.openxmlformats.org/wordprocessingml/2006/main" xmlns:w14="http://schemas.microsoft.com/office/word/2010/wordml" xmlns:w15="http://schemas.microsoft.com/office/word/2012/wordml" xmlns:w16cex="http://schemas.microsoft.com/office/word/2018/wordml/cex" xmlns:w16cid="http://schemas.microsoft.com/office/word/2016/wordml/cid" xmlns:w16="http://schemas.microsoft.com/office/word/2018/wordml" xmlns:w16du="http://schemas.microsoft.com/office/word/2023/wordml/word16du" xmlns:w16sdtdh="http://schemas.microsoft.com/office/word/2020/wordml/sdtdatahash" xmlns:w16sdtfl="http://schemas.microsoft.com/office/word/2024/wordml/sdtformatlock" xmlns:w16se="http://schemas.microsoft.com/office/word/2015/wordml/symex" xmlns:wpg="http://schemas.microsoft.com/office/word/2010/wordprocessingGroup" xmlns:wpi="http://schemas.microsoft.com/office/word/2010/wordprocessingInk" xmlns:wne="http://schemas.microsoft.com/office/word/2006/wordml" xmlns:wps="http://schemas.microsoft.com/office/word/2010/wordprocessingShape" mc:Ignorable="w14 w15 w16se w16cid w16 w16cex w16sdtdh w16sdtfl w16du wp14">
+<w:document xmlns:wpc="http://schemas.microsoft.com/office/word/2010/wordprocessingCanvas" xmlns:cx="http://schemas.microsoft.com/office/drawing/2014/chartex" xmlns:cx1="http://schemas.microsoft.com/office/drawing/2015/9/8/chartex" xmlns:cx2="http://schemas.microsoft.com/office/drawing/2015/10/21/chartex" xmlns:cx3="http://schemas.microsoft.com/office/drawing/2016/5/9/chartex" xmlns:cx4="http://schemas.microsoft.com/office/drawing/2016/5/10/chartex" xmlns:cx5="http://schemas.microsoft.com/office/drawing/2016/5/11/chartex" xmlns:cx6="http://schemas.microsoft.com/office/drawing/2016/5/12/chartex" xmlns:cx7="http://schemas.microsoft.com/office/drawing/2016/5/13/chartex" xmlns:cx8="http://schemas.microsoft.com/office/drawing/2016/5/14/chartex" xmlns:mc="http://schemas.openxmlformats.org/markup-compatibility/2006" xmlns:aink="http://schemas.microsoft.com/office/drawing/2016/ink" xmlns:am3d="http://schemas.microsoft.com/office/drawing/2017/model3d" xmlns:o="urn:schemas-microsoft-com:office:office" xmlns:oel="http://schemas.microsoft.com/office/2019/extlst" xmlns:r="http://schemas.openxmlformats.org/officeDocument/2006/relationships" xmlns:m="http://schemas.openxmlformats.org/officeDocument/2006/math" xmlns:v="urn:schemas-microsoft-com:vml" xmlns:wp14="http://schemas.microsoft.com/office/word/2010/wordprocessingDrawing" xmlns:wp="http://schemas.openxmlformats.org/drawingml/2006/wordprocessingDrawing" xmlns:w10="urn:schemas-microsoft-com:office:word" xmlns:w="http://schemas.openxmlformats.org/wordprocessingml/2006/main" xmlns:w14="http://schemas.microsoft.com/office/word/2010/wordml" xmlns:w15="http://schemas.microsoft.com/office/word/2012/wordml" xmlns:w16cei="http://schemas.microsoft.com/office/word/2026/wordml/cei" xmlns:w16cex="http://schemas.microsoft.com/office/word/2018/wordml/cex" xmlns:w16cid="http://schemas.microsoft.com/office/word/2016/wordml/cid" xmlns:w16="http://schemas.microsoft.com/office/word/2018/wordml" xmlns:w16du="http://schemas.microsoft.com/office/word/2023/wordml/word16du" xmlns:w16sdtdh="http://schemas.microsoft.com/office/word/2020/wordml/sdtdatahash" xmlns:w16sdtfl="http://schemas.microsoft.com/office/word/2024/wordml/sdtformatlock" xmlns:w16se="http://schemas.microsoft.com/office/word/2015/wordml/symex" xmlns:wpg="http://schemas.microsoft.com/office/word/2010/wordprocessingGroup" xmlns:wpi="http://schemas.microsoft.com/office/word/2010/wordprocessingInk" xmlns:wne="http://schemas.microsoft.com/office/word/2006/wordml" xmlns:wps="http://schemas.microsoft.com/office/word/2010/wordprocessingShape" mc:Ignorable="w14 w15 w16se w16cid w16 w16cex w16sdtdh w16sdtfl w16du wp14">
   <w:body>
     <w:p>
       <w:pPr>
@@ -456,7 +456,7 @@
           <w:sz w:val="22"/>
           <w:szCs w:val="22"/>
         </w:rPr>
-        <w:t>日申込</w:t>
+        <w:t>申込</w:t>
       </w:r>
     </w:p>
     <w:tbl>
@@ -3541,6 +3541,13 @@
     </w:tbl>
     <w:p/>
     <w:p>
+      <w:bookmarkStart w:id="0" w:name="_heading=h.ls8ln4h5k97v" w:colFirst="0" w:colLast="0"/>
+      <w:bookmarkEnd w:id="0"/>
+      <w:r>
+        <w:br w:type="page"/>
+      </w:r>
+    </w:p>
+    <w:p>
       <w:pPr>
         <w:rPr>
           <w:rFonts w:asciiTheme="minorHAnsi" w:eastAsiaTheme="minorHAnsi" w:hAnsiTheme="minorHAnsi"/>
@@ -3548,11 +3555,6 @@
           <w:bCs/>
         </w:rPr>
       </w:pPr>
-      <w:bookmarkStart w:id="0" w:name="_heading=h.ls8ln4h5k97v" w:colFirst="0" w:colLast="0"/>
-      <w:bookmarkEnd w:id="0"/>
-      <w:r>
-        <w:br w:type="page"/>
-      </w:r>
       <w:r>
         <w:rPr>
           <w:rFonts w:asciiTheme="minorHAnsi" w:eastAsiaTheme="minorHAnsi" w:hAnsiTheme="minorHAnsi"/>
@@ -3914,7 +3916,7 @@
     </w:p>
     <w:p>
       <w:pPr>
-        <w:jc w:val="right"/>
+        <w:ind w:right="840"/>
       </w:pPr>
       <w:r>
         <w:br w:type="page"/>
@@ -3922,12 +3924,7 @@
     </w:p>
     <w:p>
       <w:pPr>
-        <w:rPr>
-          <w:b/>
-          <w:bCs/>
-          <w:sz w:val="24"/>
-          <w:szCs w:val="24"/>
-        </w:rPr>
+        <w:ind w:right="840"/>
       </w:pPr>
       <w:r>
         <w:rPr>
@@ -4088,7 +4085,7 @@
             <w:pPr>
               <w:jc w:val="center"/>
               <w:rPr>
-                <w:rFonts w:asciiTheme="minorEastAsia" w:hAnsiTheme="minorEastAsia" w:hint="eastAsia"/>
+                <w:rFonts w:asciiTheme="minorEastAsia" w:hAnsiTheme="minorEastAsia"/>
               </w:rPr>
             </w:pPr>
             <w:r>
@@ -6477,7 +6474,19 @@
     </w:p>
     <w:p>
       <w:pPr>
-        <w:ind w:left="723" w:hanging="723"/>
+        <w:rPr>
+          <w:rFonts w:asciiTheme="minorEastAsia" w:hAnsiTheme="minorEastAsia"/>
+        </w:rPr>
+      </w:pPr>
+      <w:r>
+        <w:rPr>
+          <w:rFonts w:asciiTheme="minorEastAsia" w:hAnsiTheme="minorEastAsia"/>
+        </w:rPr>
+        <w:br w:type="page"/>
+      </w:r>
+    </w:p>
+    <w:p>
+      <w:pPr>
         <w:jc w:val="center"/>
         <w:rPr>
           <w:b/>
@@ -6486,12 +6495,6 @@
           <w:szCs w:val="24"/>
         </w:rPr>
       </w:pPr>
-      <w:r>
-        <w:rPr>
-          <w:rFonts w:asciiTheme="minorEastAsia" w:hAnsiTheme="minorEastAsia"/>
-        </w:rPr>
-        <w:br w:type="page"/>
-      </w:r>
       <w:r>
         <w:rPr>
           <w:b/>
@@ -9029,7 +9032,7 @@
 </file>
 
 <file path=word/endnotes.xml><?xml version="1.0" encoding="utf-8"?>
-<w:endnotes xmlns:wpc="http://schemas.microsoft.com/office/word/2010/wordprocessingCanvas" xmlns:cx="http://schemas.microsoft.com/office/drawing/2014/chartex" xmlns:cx1="http://schemas.microsoft.com/office/drawing/2015/9/8/chartex" xmlns:cx2="http://schemas.microsoft.com/office/drawing/2015/10/21/chartex" xmlns:cx3="http://schemas.microsoft.com/office/drawing/2016/5/9/chartex" xmlns:cx4="http://schemas.microsoft.com/office/drawing/2016/5/10/chartex" xmlns:cx5="http://schemas.microsoft.com/office/drawing/2016/5/11/chartex" xmlns:cx6="http://schemas.microsoft.com/office/drawing/2016/5/12/chartex" xmlns:cx7="http://schemas.microsoft.com/office/drawing/2016/5/13/chartex" xmlns:cx8="http://schemas.microsoft.com/office/drawing/2016/5/14/chartex" xmlns:mc="http://schemas.openxmlformats.org/markup-compatibility/2006" xmlns:aink="http://schemas.microsoft.com/office/drawing/2016/ink" xmlns:am3d="http://schemas.microsoft.com/office/drawing/2017/model3d" xmlns:o="urn:schemas-microsoft-com:office:office" xmlns:oel="http://schemas.microsoft.com/office/2019/extlst" xmlns:r="http://schemas.openxmlformats.org/officeDocument/2006/relationships" xmlns:m="http://schemas.openxmlformats.org/officeDocument/2006/math" xmlns:v="urn:schemas-microsoft-com:vml" xmlns:wp14="http://schemas.microsoft.com/office/word/2010/wordprocessingDrawing" xmlns:wp="http://schemas.openxmlformats.org/drawingml/2006/wordprocessingDrawing" xmlns:w10="urn:schemas-microsoft-com:office:word" xmlns:w="http://schemas.openxmlformats.org/wordprocessingml/2006/main" xmlns:w14="http://schemas.microsoft.com/office/word/2010/wordml" xmlns:w15="http://schemas.microsoft.com/office/word/2012/wordml" xmlns:w16cex="http://schemas.microsoft.com/office/word/2018/wordml/cex" xmlns:w16cid="http://schemas.microsoft.com/office/word/2016/wordml/cid" xmlns:w16="http://schemas.microsoft.com/office/word/2018/wordml" xmlns:w16du="http://schemas.microsoft.com/office/word/2023/wordml/word16du" xmlns:w16sdtdh="http://schemas.microsoft.com/office/word/2020/wordml/sdtdatahash" xmlns:w16sdtfl="http://schemas.microsoft.com/office/word/2024/wordml/sdtformatlock" xmlns:w16se="http://schemas.microsoft.com/office/word/2015/wordml/symex" xmlns:wpg="http://schemas.microsoft.com/office/word/2010/wordprocessingGroup" xmlns:wpi="http://schemas.microsoft.com/office/word/2010/wordprocessingInk" xmlns:wne="http://schemas.microsoft.com/office/word/2006/wordml" xmlns:wps="http://schemas.microsoft.com/office/word/2010/wordprocessingShape" mc:Ignorable="w14 w15 w16se w16cid w16 w16cex w16sdtdh w16sdtfl w16du wp14">
+<w:endnotes xmlns:wpc="http://schemas.microsoft.com/office/word/2010/wordprocessingCanvas" xmlns:cx="http://schemas.microsoft.com/office/drawing/2014/chartex" xmlns:cx1="http://schemas.microsoft.com/office/drawing/2015/9/8/chartex" xmlns:cx2="http://schemas.microsoft.com/office/drawing/2015/10/21/chartex" xmlns:cx3="http://schemas.microsoft.com/office/drawing/2016/5/9/chartex" xmlns:cx4="http://schemas.microsoft.com/office/drawing/2016/5/10/chartex" xmlns:cx5="http://schemas.microsoft.com/office/drawing/2016/5/11/chartex" xmlns:cx6="http://schemas.microsoft.com/office/drawing/2016/5/12/chartex" xmlns:cx7="http://schemas.microsoft.com/office/drawing/2016/5/13/chartex" xmlns:cx8="http://schemas.microsoft.com/office/drawing/2016/5/14/chartex" xmlns:mc="http://schemas.openxmlformats.org/markup-compatibility/2006" xmlns:aink="http://schemas.microsoft.com/office/drawing/2016/ink" xmlns:am3d="http://schemas.microsoft.com/office/drawing/2017/model3d" xmlns:o="urn:schemas-microsoft-com:office:office" xmlns:oel="http://schemas.microsoft.com/office/2019/extlst" xmlns:r="http://schemas.openxmlformats.org/officeDocument/2006/relationships" xmlns:m="http://schemas.openxmlformats.org/officeDocument/2006/math" xmlns:v="urn:schemas-microsoft-com:vml" xmlns:wp14="http://schemas.microsoft.com/office/word/2010/wordprocessingDrawing" xmlns:wp="http://schemas.openxmlformats.org/drawingml/2006/wordprocessingDrawing" xmlns:w10="urn:schemas-microsoft-com:office:word" xmlns:w="http://schemas.openxmlformats.org/wordprocessingml/2006/main" xmlns:w14="http://schemas.microsoft.com/office/word/2010/wordml" xmlns:w15="http://schemas.microsoft.com/office/word/2012/wordml" xmlns:w16cei="http://schemas.microsoft.com/office/word/2026/wordml/cei" xmlns:w16cex="http://schemas.microsoft.com/office/word/2018/wordml/cex" xmlns:w16cid="http://schemas.microsoft.com/office/word/2016/wordml/cid" xmlns:w16="http://schemas.microsoft.com/office/word/2018/wordml" xmlns:w16du="http://schemas.microsoft.com/office/word/2023/wordml/word16du" xmlns:w16sdtdh="http://schemas.microsoft.com/office/word/2020/wordml/sdtdatahash" xmlns:w16sdtfl="http://schemas.microsoft.com/office/word/2024/wordml/sdtformatlock" xmlns:w16se="http://schemas.microsoft.com/office/word/2015/wordml/symex" xmlns:wpg="http://schemas.microsoft.com/office/word/2010/wordprocessingGroup" xmlns:wpi="http://schemas.microsoft.com/office/word/2010/wordprocessingInk" xmlns:wne="http://schemas.microsoft.com/office/word/2006/wordml" xmlns:wps="http://schemas.microsoft.com/office/word/2010/wordprocessingShape" mc:Ignorable="w14 w15 w16se w16cid w16 w16cex w16sdtdh w16sdtfl w16du wp14">
   <w:endnote w:type="separator" w:id="-1">
     <w:p>
       <w:r>
@@ -9048,7 +9051,7 @@
 </file>
 
 <file path=word/footer1.xml><?xml version="1.0" encoding="utf-8"?>
-<w:ftr xmlns:wpc="http://schemas.microsoft.com/office/word/2010/wordprocessingCanvas" xmlns:cx="http://schemas.microsoft.com/office/drawing/2014/chartex" xmlns:cx1="http://schemas.microsoft.com/office/drawing/2015/9/8/chartex" xmlns:cx2="http://schemas.microsoft.com/office/drawing/2015/10/21/chartex" xmlns:cx3="http://schemas.microsoft.com/office/drawing/2016/5/9/chartex" xmlns:cx4="http://schemas.microsoft.com/office/drawing/2016/5/10/chartex" xmlns:cx5="http://schemas.microsoft.com/office/drawing/2016/5/11/chartex" xmlns:cx6="http://schemas.microsoft.com/office/drawing/2016/5/12/chartex" xmlns:cx7="http://schemas.microsoft.com/office/drawing/2016/5/13/chartex" xmlns:cx8="http://schemas.microsoft.com/office/drawing/2016/5/14/chartex" xmlns:mc="http://schemas.openxmlformats.org/markup-compatibility/2006" xmlns:aink="http://schemas.microsoft.com/office/drawing/2016/ink" xmlns:am3d="http://schemas.microsoft.com/office/drawing/2017/model3d" xmlns:o="urn:schemas-microsoft-com:office:office" xmlns:oel="http://schemas.microsoft.com/office/2019/extlst" xmlns:r="http://schemas.openxmlformats.org/officeDocument/2006/relationships" xmlns:m="http://schemas.openxmlformats.org/officeDocument/2006/math" xmlns:v="urn:schemas-microsoft-com:vml" xmlns:wp14="http://schemas.microsoft.com/office/word/2010/wordprocessingDrawing" xmlns:wp="http://schemas.openxmlformats.org/drawingml/2006/wordprocessingDrawing" xmlns:w10="urn:schemas-microsoft-com:office:word" xmlns:w="http://schemas.openxmlformats.org/wordprocessingml/2006/main" xmlns:w14="http://schemas.microsoft.com/office/word/2010/wordml" xmlns:w15="http://schemas.microsoft.com/office/word/2012/wordml" xmlns:w16cex="http://schemas.microsoft.com/office/word/2018/wordml/cex" xmlns:w16cid="http://schemas.microsoft.com/office/word/2016/wordml/cid" xmlns:w16="http://schemas.microsoft.com/office/word/2018/wordml" xmlns:w16du="http://schemas.microsoft.com/office/word/2023/wordml/word16du" xmlns:w16sdtdh="http://schemas.microsoft.com/office/word/2020/wordml/sdtdatahash" xmlns:w16sdtfl="http://schemas.microsoft.com/office/word/2024/wordml/sdtformatlock" xmlns:w16se="http://schemas.microsoft.com/office/word/2015/wordml/symex" xmlns:wpg="http://schemas.microsoft.com/office/word/2010/wordprocessingGroup" xmlns:wpi="http://schemas.microsoft.com/office/word/2010/wordprocessingInk" xmlns:wne="http://schemas.microsoft.com/office/word/2006/wordml" xmlns:wps="http://schemas.microsoft.com/office/word/2010/wordprocessingShape" mc:Ignorable="w14 w15 w16se w16cid w16 w16cex w16sdtdh w16sdtfl w16du wp14">
+<w:ftr xmlns:wpc="http://schemas.microsoft.com/office/word/2010/wordprocessingCanvas" xmlns:cx="http://schemas.microsoft.com/office/drawing/2014/chartex" xmlns:cx1="http://schemas.microsoft.com/office/drawing/2015/9/8/chartex" xmlns:cx2="http://schemas.microsoft.com/office/drawing/2015/10/21/chartex" xmlns:cx3="http://schemas.microsoft.com/office/drawing/2016/5/9/chartex" xmlns:cx4="http://schemas.microsoft.com/office/drawing/2016/5/10/chartex" xmlns:cx5="http://schemas.microsoft.com/office/drawing/2016/5/11/chartex" xmlns:cx6="http://schemas.microsoft.com/office/drawing/2016/5/12/chartex" xmlns:cx7="http://schemas.microsoft.com/office/drawing/2016/5/13/chartex" xmlns:cx8="http://schemas.microsoft.com/office/drawing/2016/5/14/chartex" xmlns:mc="http://schemas.openxmlformats.org/markup-compatibility/2006" xmlns:aink="http://schemas.microsoft.com/office/drawing/2016/ink" xmlns:am3d="http://schemas.microsoft.com/office/drawing/2017/model3d" xmlns:o="urn:schemas-microsoft-com:office:office" xmlns:oel="http://schemas.microsoft.com/office/2019/extlst" xmlns:r="http://schemas.openxmlformats.org/officeDocument/2006/relationships" xmlns:m="http://schemas.openxmlformats.org/officeDocument/2006/math" xmlns:v="urn:schemas-microsoft-com:vml" xmlns:wp14="http://schemas.microsoft.com/office/word/2010/wordprocessingDrawing" xmlns:wp="http://schemas.openxmlformats.org/drawingml/2006/wordprocessingDrawing" xmlns:w10="urn:schemas-microsoft-com:office:word" xmlns:w="http://schemas.openxmlformats.org/wordprocessingml/2006/main" xmlns:w14="http://schemas.microsoft.com/office/word/2010/wordml" xmlns:w15="http://schemas.microsoft.com/office/word/2012/wordml" xmlns:w16cei="http://schemas.microsoft.com/office/word/2026/wordml/cei" xmlns:w16cex="http://schemas.microsoft.com/office/word/2018/wordml/cex" xmlns:w16cid="http://schemas.microsoft.com/office/word/2016/wordml/cid" xmlns:w16="http://schemas.microsoft.com/office/word/2018/wordml" xmlns:w16du="http://schemas.microsoft.com/office/word/2023/wordml/word16du" xmlns:w16sdtdh="http://schemas.microsoft.com/office/word/2020/wordml/sdtdatahash" xmlns:w16sdtfl="http://schemas.microsoft.com/office/word/2024/wordml/sdtformatlock" xmlns:w16se="http://schemas.microsoft.com/office/word/2015/wordml/symex" xmlns:wpg="http://schemas.microsoft.com/office/word/2010/wordprocessingGroup" xmlns:wpi="http://schemas.microsoft.com/office/word/2010/wordprocessingInk" xmlns:wne="http://schemas.microsoft.com/office/word/2006/wordml" xmlns:wps="http://schemas.microsoft.com/office/word/2010/wordprocessingShape" mc:Ignorable="w14 w15 w16se w16cid w16 w16cex w16sdtdh w16sdtfl w16du wp14">
   <w:p>
     <w:pPr>
       <w:pBdr>
@@ -9123,7 +9126,7 @@
 </file>
 
 <file path=word/footnotes.xml><?xml version="1.0" encoding="utf-8"?>
-<w:footnotes xmlns:wpc="http://schemas.microsoft.com/office/word/2010/wordprocessingCanvas" xmlns:cx="http://schemas.microsoft.com/office/drawing/2014/chartex" xmlns:cx1="http://schemas.microsoft.com/office/drawing/2015/9/8/chartex" xmlns:cx2="http://schemas.microsoft.com/office/drawing/2015/10/21/chartex" xmlns:cx3="http://schemas.microsoft.com/office/drawing/2016/5/9/chartex" xmlns:cx4="http://schemas.microsoft.com/office/drawing/2016/5/10/chartex" xmlns:cx5="http://schemas.microsoft.com/office/drawing/2016/5/11/chartex" xmlns:cx6="http://schemas.microsoft.com/office/drawing/2016/5/12/chartex" xmlns:cx7="http://schemas.microsoft.com/office/drawing/2016/5/13/chartex" xmlns:cx8="http://schemas.microsoft.com/office/drawing/2016/5/14/chartex" xmlns:mc="http://schemas.openxmlformats.org/markup-compatibility/2006" xmlns:aink="http://schemas.microsoft.com/office/drawing/2016/ink" xmlns:am3d="http://schemas.microsoft.com/office/drawing/2017/model3d" xmlns:o="urn:schemas-microsoft-com:office:office" xmlns:oel="http://schemas.microsoft.com/office/2019/extlst" xmlns:r="http://schemas.openxmlformats.org/officeDocument/2006/relationships" xmlns:m="http://schemas.openxmlformats.org/officeDocument/2006/math" xmlns:v="urn:schemas-microsoft-com:vml" xmlns:wp14="http://schemas.microsoft.com/office/word/2010/wordprocessingDrawing" xmlns:wp="http://schemas.openxmlformats.org/drawingml/2006/wordprocessingDrawing" xmlns:w10="urn:schemas-microsoft-com:office:word" xmlns:w="http://schemas.openxmlformats.org/wordprocessingml/2006/main" xmlns:w14="http://schemas.microsoft.com/office/word/2010/wordml" xmlns:w15="http://schemas.microsoft.com/office/word/2012/wordml" xmlns:w16cex="http://schemas.microsoft.com/office/word/2018/wordml/cex" xmlns:w16cid="http://schemas.microsoft.com/office/word/2016/wordml/cid" xmlns:w16="http://schemas.microsoft.com/office/word/2018/wordml" xmlns:w16du="http://schemas.microsoft.com/office/word/2023/wordml/word16du" xmlns:w16sdtdh="http://schemas.microsoft.com/office/word/2020/wordml/sdtdatahash" xmlns:w16sdtfl="http://schemas.microsoft.com/office/word/2024/wordml/sdtformatlock" xmlns:w16se="http://schemas.microsoft.com/office/word/2015/wordml/symex" xmlns:wpg="http://schemas.microsoft.com/office/word/2010/wordprocessingGroup" xmlns:wpi="http://schemas.microsoft.com/office/word/2010/wordprocessingInk" xmlns:wne="http://schemas.microsoft.com/office/word/2006/wordml" xmlns:wps="http://schemas.microsoft.com/office/word/2010/wordprocessingShape" mc:Ignorable="w14 w15 w16se w16cid w16 w16cex w16sdtdh w16sdtfl w16du wp14">
+<w:footnotes xmlns:wpc="http://schemas.microsoft.com/office/word/2010/wordprocessingCanvas" xmlns:cx="http://schemas.microsoft.com/office/drawing/2014/chartex" xmlns:cx1="http://schemas.microsoft.com/office/drawing/2015/9/8/chartex" xmlns:cx2="http://schemas.microsoft.com/office/drawing/2015/10/21/chartex" xmlns:cx3="http://schemas.microsoft.com/office/drawing/2016/5/9/chartex" xmlns:cx4="http://schemas.microsoft.com/office/drawing/2016/5/10/chartex" xmlns:cx5="http://schemas.microsoft.com/office/drawing/2016/5/11/chartex" xmlns:cx6="http://schemas.microsoft.com/office/drawing/2016/5/12/chartex" xmlns:cx7="http://schemas.microsoft.com/office/drawing/2016/5/13/chartex" xmlns:cx8="http://schemas.microsoft.com/office/drawing/2016/5/14/chartex" xmlns:mc="http://schemas.openxmlformats.org/markup-compatibility/2006" xmlns:aink="http://schemas.microsoft.com/office/drawing/2016/ink" xmlns:am3d="http://schemas.microsoft.com/office/drawing/2017/model3d" xmlns:o="urn:schemas-microsoft-com:office:office" xmlns:oel="http://schemas.microsoft.com/office/2019/extlst" xmlns:r="http://schemas.openxmlformats.org/officeDocument/2006/relationships" xmlns:m="http://schemas.openxmlformats.org/officeDocument/2006/math" xmlns:v="urn:schemas-microsoft-com:vml" xmlns:wp14="http://schemas.microsoft.com/office/word/2010/wordprocessingDrawing" xmlns:wp="http://schemas.openxmlformats.org/drawingml/2006/wordprocessingDrawing" xmlns:w10="urn:schemas-microsoft-com:office:word" xmlns:w="http://schemas.openxmlformats.org/wordprocessingml/2006/main" xmlns:w14="http://schemas.microsoft.com/office/word/2010/wordml" xmlns:w15="http://schemas.microsoft.com/office/word/2012/wordml" xmlns:w16cei="http://schemas.microsoft.com/office/word/2026/wordml/cei" xmlns:w16cex="http://schemas.microsoft.com/office/word/2018/wordml/cex" xmlns:w16cid="http://schemas.microsoft.com/office/word/2016/wordml/cid" xmlns:w16="http://schemas.microsoft.com/office/word/2018/wordml" xmlns:w16du="http://schemas.microsoft.com/office/word/2023/wordml/word16du" xmlns:w16sdtdh="http://schemas.microsoft.com/office/word/2020/wordml/sdtdatahash" xmlns:w16sdtfl="http://schemas.microsoft.com/office/word/2024/wordml/sdtformatlock" xmlns:w16se="http://schemas.microsoft.com/office/word/2015/wordml/symex" xmlns:wpg="http://schemas.microsoft.com/office/word/2010/wordprocessingGroup" xmlns:wpi="http://schemas.microsoft.com/office/word/2010/wordprocessingInk" xmlns:wne="http://schemas.microsoft.com/office/word/2006/wordml" xmlns:wps="http://schemas.microsoft.com/office/word/2010/wordprocessingShape" mc:Ignorable="w14 w15 w16se w16cid w16 w16cex w16sdtdh w16sdtfl w16du wp14">
   <w:footnote w:type="separator" w:id="-1">
     <w:p>
       <w:r>
@@ -9142,7 +9145,7 @@
 </file>
 
 <file path=word/numbering.xml><?xml version="1.0" encoding="utf-8"?>
-<w:numbering xmlns:wpc="http://schemas.microsoft.com/office/word/2010/wordprocessingCanvas" xmlns:cx="http://schemas.microsoft.com/office/drawing/2014/chartex" xmlns:cx1="http://schemas.microsoft.com/office/drawing/2015/9/8/chartex" xmlns:cx2="http://schemas.microsoft.com/office/drawing/2015/10/21/chartex" xmlns:cx3="http://schemas.microsoft.com/office/drawing/2016/5/9/chartex" xmlns:cx4="http://schemas.microsoft.com/office/drawing/2016/5/10/chartex" xmlns:cx5="http://schemas.microsoft.com/office/drawing/2016/5/11/chartex" xmlns:cx6="http://schemas.microsoft.com/office/drawing/2016/5/12/chartex" xmlns:cx7="http://schemas.microsoft.com/office/drawing/2016/5/13/chartex" xmlns:cx8="http://schemas.microsoft.com/office/drawing/2016/5/14/chartex" xmlns:mc="http://schemas.openxmlformats.org/markup-compatibility/2006" xmlns:aink="http://schemas.microsoft.com/office/drawing/2016/ink" xmlns:am3d="http://schemas.microsoft.com/office/drawing/2017/model3d" xmlns:o="urn:schemas-microsoft-com:office:office" xmlns:oel="http://schemas.microsoft.com/office/2019/extlst" xmlns:r="http://schemas.openxmlformats.org/officeDocument/2006/relationships" xmlns:m="http://schemas.openxmlformats.org/officeDocument/2006/math" xmlns:v="urn:schemas-microsoft-com:vml" xmlns:wp14="http://schemas.microsoft.com/office/word/2010/wordprocessingDrawing" xmlns:wp="http://schemas.openxmlformats.org/drawingml/2006/wordprocessingDrawing" xmlns:w10="urn:schemas-microsoft-com:office:word" xmlns:w="http://schemas.openxmlformats.org/wordprocessingml/2006/main" xmlns:w14="http://schemas.microsoft.com/office/word/2010/wordml" xmlns:w15="http://schemas.microsoft.com/office/word/2012/wordml" xmlns:w16cex="http://schemas.microsoft.com/office/word/2018/wordml/cex" xmlns:w16cid="http://schemas.microsoft.com/office/word/2016/wordml/cid" xmlns:w16="http://schemas.microsoft.com/office/word/2018/wordml" xmlns:w16du="http://schemas.microsoft.com/office/word/2023/wordml/word16du" xmlns:w16sdtdh="http://schemas.microsoft.com/office/word/2020/wordml/sdtdatahash" xmlns:w16sdtfl="http://schemas.microsoft.com/office/word/2024/wordml/sdtformatlock" xmlns:w16se="http://schemas.microsoft.com/office/word/2015/wordml/symex" xmlns:wpg="http://schemas.microsoft.com/office/word/2010/wordprocessingGroup" xmlns:wpi="http://schemas.microsoft.com/office/word/2010/wordprocessingInk" xmlns:wne="http://schemas.microsoft.com/office/word/2006/wordml" xmlns:wps="http://schemas.microsoft.com/office/word/2010/wordprocessingShape" mc:Ignorable="w14 w15 w16se w16cid w16 w16cex w16sdtdh w16sdtfl w16du wp14">
+<w:numbering xmlns:wpc="http://schemas.microsoft.com/office/word/2010/wordprocessingCanvas" xmlns:cx="http://schemas.microsoft.com/office/drawing/2014/chartex" xmlns:cx1="http://schemas.microsoft.com/office/drawing/2015/9/8/chartex" xmlns:cx2="http://schemas.microsoft.com/office/drawing/2015/10/21/chartex" xmlns:cx3="http://schemas.microsoft.com/office/drawing/2016/5/9/chartex" xmlns:cx4="http://schemas.microsoft.com/office/drawing/2016/5/10/chartex" xmlns:cx5="http://schemas.microsoft.com/office/drawing/2016/5/11/chartex" xmlns:cx6="http://schemas.microsoft.com/office/drawing/2016/5/12/chartex" xmlns:cx7="http://schemas.microsoft.com/office/drawing/2016/5/13/chartex" xmlns:cx8="http://schemas.microsoft.com/office/drawing/2016/5/14/chartex" xmlns:mc="http://schemas.openxmlformats.org/markup-compatibility/2006" xmlns:aink="http://schemas.microsoft.com/office/drawing/2016/ink" xmlns:am3d="http://schemas.microsoft.com/office/drawing/2017/model3d" xmlns:o="urn:schemas-microsoft-com:office:office" xmlns:oel="http://schemas.microsoft.com/office/2019/extlst" xmlns:r="http://schemas.openxmlformats.org/officeDocument/2006/relationships" xmlns:m="http://schemas.openxmlformats.org/officeDocument/2006/math" xmlns:v="urn:schemas-microsoft-com:vml" xmlns:wp14="http://schemas.microsoft.com/office/word/2010/wordprocessingDrawing" xmlns:wp="http://schemas.openxmlformats.org/drawingml/2006/wordprocessingDrawing" xmlns:w10="urn:schemas-microsoft-com:office:word" xmlns:w="http://schemas.openxmlformats.org/wordprocessingml/2006/main" xmlns:w14="http://schemas.microsoft.com/office/word/2010/wordml" xmlns:w15="http://schemas.microsoft.com/office/word/2012/wordml" xmlns:w16cei="http://schemas.microsoft.com/office/word/2026/wordml/cei" xmlns:w16cex="http://schemas.microsoft.com/office/word/2018/wordml/cex" xmlns:w16cid="http://schemas.microsoft.com/office/word/2016/wordml/cid" xmlns:w16="http://schemas.microsoft.com/office/word/2018/wordml" xmlns:w16du="http://schemas.microsoft.com/office/word/2023/wordml/word16du" xmlns:w16sdtdh="http://schemas.microsoft.com/office/word/2020/wordml/sdtdatahash" xmlns:w16sdtfl="http://schemas.microsoft.com/office/word/2024/wordml/sdtformatlock" xmlns:w16se="http://schemas.microsoft.com/office/word/2015/wordml/symex" xmlns:wpg="http://schemas.microsoft.com/office/word/2010/wordprocessingGroup" xmlns:wpi="http://schemas.microsoft.com/office/word/2010/wordprocessingInk" xmlns:wne="http://schemas.microsoft.com/office/word/2006/wordml" xmlns:wps="http://schemas.microsoft.com/office/word/2010/wordprocessingShape" mc:Ignorable="w14 w15 w16se w16cid w16 w16cex w16sdtdh w16sdtfl w16du wp14">
   <w:abstractNum w:abstractNumId="0" w15:restartNumberingAfterBreak="0">
     <w:nsid w:val="14C15382"/>
     <w:multiLevelType w:val="multilevel"/>
@@ -11349,28 +11352,28 @@
 </file>
 
 <file path=customXml/item1.xml><?xml version="1.0" encoding="utf-8"?>
+<b:Sources xmlns:b="http://schemas.openxmlformats.org/officeDocument/2006/bibliography" xmlns="http://schemas.openxmlformats.org/officeDocument/2006/bibliography" SelectedStyle="\APASixthEditionOfficeOnline.xsl" StyleName="APA" Version="6"/>
+</file>
+
+<file path=customXml/item2.xml><?xml version="1.0" encoding="utf-8"?>
 <go:gDocsCustomXmlDataStorage xmlns:go="http://customooxmlschemas.google.com/" xmlns:r="http://schemas.openxmlformats.org/officeDocument/2006/relationships" uri="GoogleDocsCustomDataVersion2">
   <go:docsCustomData xmlns:go="http://customooxmlschemas.google.com/" roundtripDataSignature="AMtx7mhfYdXSGu0zy+MuQk6rjb/Y5MyolQ==">CgMxLjAyDmguNmJ3cnNhMnV1eW1vMg5oLmxzOGxuNGg1azk3djIOaC5odDI2Zm42cWNkdzkyDmgud28ya3FvaWJ5ZG4xMg5oLnQ5d3ByYWxqNGhrNDIOaC5xZnE4am9yY2ZjdGI4AHIhMTYydHZ3UU5VV2ZWYjlSX2VnRVM4bWZIT2ZOa3pmM3lU</go:docsCustomData>
 </go:gDocsCustomXmlDataStorage>
 </file>
 
-<file path=customXml/item2.xml><?xml version="1.0" encoding="utf-8"?>
-<b:Sources xmlns:b="http://schemas.openxmlformats.org/officeDocument/2006/bibliography" xmlns="http://schemas.openxmlformats.org/officeDocument/2006/bibliography" SelectedStyle="\APASixthEditionOfficeOnline.xsl" StyleName="APA" Version="6"/>
+<file path=customXml/itemProps1.xml><?xml version="1.0" encoding="utf-8"?>
+<ds:datastoreItem xmlns:ds="http://schemas.openxmlformats.org/officeDocument/2006/customXml" ds:itemID="{95B87605-462A-47AE-A027-51FD9584CDCD}">
+  <ds:schemaRefs>
+    <ds:schemaRef ds:uri="http://schemas.openxmlformats.org/officeDocument/2006/bibliography"/>
+  </ds:schemaRefs>
+</ds:datastoreItem>
 </file>
 
-<file path=customXml/itemProps1.xml><?xml version="1.0" encoding="utf-8"?>
+<file path=customXml/itemProps2.xml><?xml version="1.0" encoding="utf-8"?>
 <ds:datastoreItem xmlns:ds="http://schemas.openxmlformats.org/officeDocument/2006/customXml" ds:itemID="{11111111-1234-1234-1234-123412341234}">
   <ds:schemaRefs>
     <ds:schemaRef ds:uri="http://customooxmlschemas.google.com/"/>
     <ds:schemaRef ds:uri="http://schemas.openxmlformats.org/officeDocument/2006/relationships"/>
   </ds:schemaRefs>
 </ds:datastoreItem>
-</file>
-
-<file path=customXml/itemProps2.xml><?xml version="1.0" encoding="utf-8"?>
-<ds:datastoreItem xmlns:ds="http://schemas.openxmlformats.org/officeDocument/2006/customXml" ds:itemID="{95B87605-462A-47AE-A027-51FD9584CDCD}">
-  <ds:schemaRefs>
-    <ds:schemaRef ds:uri="http://schemas.openxmlformats.org/officeDocument/2006/bibliography"/>
-  </ds:schemaRefs>
-</ds:datastoreItem>
 </file>
</xml_diff>

<commit_message>
font revision properties nyuukai-todoke
</commit_message>
<xml_diff>
--- a/backend/src/main/resources/templates/participate_solar.docx
+++ b/backend/src/main/resources/templates/participate_solar.docx
@@ -1,6 +1,6 @@
 
 <file path=word/document.xml><?xml version="1.0" encoding="utf-8"?>
-<w:document xmlns:wpc="http://schemas.microsoft.com/office/word/2010/wordprocessingCanvas" xmlns:cx="http://schemas.microsoft.com/office/drawing/2014/chartex" xmlns:cx1="http://schemas.microsoft.com/office/drawing/2015/9/8/chartex" xmlns:cx2="http://schemas.microsoft.com/office/drawing/2015/10/21/chartex" xmlns:cx3="http://schemas.microsoft.com/office/drawing/2016/5/9/chartex" xmlns:cx4="http://schemas.microsoft.com/office/drawing/2016/5/10/chartex" xmlns:cx5="http://schemas.microsoft.com/office/drawing/2016/5/11/chartex" xmlns:cx6="http://schemas.microsoft.com/office/drawing/2016/5/12/chartex" xmlns:cx7="http://schemas.microsoft.com/office/drawing/2016/5/13/chartex" xmlns:cx8="http://schemas.microsoft.com/office/drawing/2016/5/14/chartex" xmlns:mc="http://schemas.openxmlformats.org/markup-compatibility/2006" xmlns:aink="http://schemas.microsoft.com/office/drawing/2016/ink" xmlns:am3d="http://schemas.microsoft.com/office/drawing/2017/model3d" xmlns:o="urn:schemas-microsoft-com:office:office" xmlns:oel="http://schemas.microsoft.com/office/2019/extlst" xmlns:r="http://schemas.openxmlformats.org/officeDocument/2006/relationships" xmlns:m="http://schemas.openxmlformats.org/officeDocument/2006/math" xmlns:v="urn:schemas-microsoft-com:vml" xmlns:wp14="http://schemas.microsoft.com/office/word/2010/wordprocessingDrawing" xmlns:wp="http://schemas.openxmlformats.org/drawingml/2006/wordprocessingDrawing" xmlns:w10="urn:schemas-microsoft-com:office:word" xmlns:w="http://schemas.openxmlformats.org/wordprocessingml/2006/main" xmlns:w14="http://schemas.microsoft.com/office/word/2010/wordml" xmlns:w15="http://schemas.microsoft.com/office/word/2012/wordml" xmlns:w16cei="http://schemas.microsoft.com/office/word/2026/wordml/cei" xmlns:w16cex="http://schemas.microsoft.com/office/word/2018/wordml/cex" xmlns:w16cid="http://schemas.microsoft.com/office/word/2016/wordml/cid" xmlns:w16="http://schemas.microsoft.com/office/word/2018/wordml" xmlns:w16du="http://schemas.microsoft.com/office/word/2023/wordml/word16du" xmlns:w16sdtdh="http://schemas.microsoft.com/office/word/2020/wordml/sdtdatahash" xmlns:w16sdtfl="http://schemas.microsoft.com/office/word/2024/wordml/sdtformatlock" xmlns:w16se="http://schemas.microsoft.com/office/word/2015/wordml/symex" xmlns:wpg="http://schemas.microsoft.com/office/word/2010/wordprocessingGroup" xmlns:wpi="http://schemas.microsoft.com/office/word/2010/wordprocessingInk" xmlns:wne="http://schemas.microsoft.com/office/word/2006/wordml" xmlns:wps="http://schemas.microsoft.com/office/word/2010/wordprocessingShape" mc:Ignorable="w14 w15 w16se w16cid w16 w16cex w16sdtdh w16sdtfl w16du wp14">
+<w:document xmlns:wpc="http://schemas.microsoft.com/office/word/2010/wordprocessingCanvas" xmlns:cx="http://schemas.microsoft.com/office/drawing/2014/chartex" xmlns:cx1="http://schemas.microsoft.com/office/drawing/2015/9/8/chartex" xmlns:cx2="http://schemas.microsoft.com/office/drawing/2015/10/21/chartex" xmlns:cx3="http://schemas.microsoft.com/office/drawing/2016/5/9/chartex" xmlns:cx4="http://schemas.microsoft.com/office/drawing/2016/5/10/chartex" xmlns:cx5="http://schemas.microsoft.com/office/drawing/2016/5/11/chartex" xmlns:cx6="http://schemas.microsoft.com/office/drawing/2016/5/12/chartex" xmlns:cx7="http://schemas.microsoft.com/office/drawing/2016/5/13/chartex" xmlns:cx8="http://schemas.microsoft.com/office/drawing/2016/5/14/chartex" xmlns:mc="http://schemas.openxmlformats.org/markup-compatibility/2006" xmlns:aink="http://schemas.microsoft.com/office/drawing/2016/ink" xmlns:am3d="http://schemas.microsoft.com/office/drawing/2017/model3d" xmlns:o="urn:schemas-microsoft-com:office:office" xmlns:oel="http://schemas.microsoft.com/office/2019/extlst" xmlns:r="http://schemas.openxmlformats.org/officeDocument/2006/relationships" xmlns:m="http://schemas.openxmlformats.org/officeDocument/2006/math" xmlns:v="urn:schemas-microsoft-com:vml" xmlns:wp14="http://schemas.microsoft.com/office/word/2010/wordprocessingDrawing" xmlns:wp="http://schemas.openxmlformats.org/drawingml/2006/wordprocessingDrawing" xmlns:w10="urn:schemas-microsoft-com:office:word" xmlns:w="http://schemas.openxmlformats.org/wordprocessingml/2006/main" xmlns:w14="http://schemas.microsoft.com/office/word/2010/wordml" xmlns:w15="http://schemas.microsoft.com/office/word/2012/wordml" xmlns:w16cex="http://schemas.microsoft.com/office/word/2018/wordml/cex" xmlns:w16cid="http://schemas.microsoft.com/office/word/2016/wordml/cid" xmlns:w16="http://schemas.microsoft.com/office/word/2018/wordml" xmlns:w16du="http://schemas.microsoft.com/office/word/2023/wordml/word16du" xmlns:w16sdtdh="http://schemas.microsoft.com/office/word/2020/wordml/sdtdatahash" xmlns:w16sdtfl="http://schemas.microsoft.com/office/word/2024/wordml/sdtformatlock" xmlns:w16se="http://schemas.microsoft.com/office/word/2015/wordml/symex" xmlns:wpg="http://schemas.microsoft.com/office/word/2010/wordprocessingGroup" xmlns:wpi="http://schemas.microsoft.com/office/word/2010/wordprocessingInk" xmlns:wne="http://schemas.microsoft.com/office/word/2006/wordml" xmlns:wps="http://schemas.microsoft.com/office/word/2010/wordprocessingShape" mc:Ignorable="w14 w15 w16se w16cid w16 w16cex w16sdtdh w16sdtfl w16du wp14">
   <w:body>
     <w:p>
       <w:pPr>
@@ -3656,7 +3656,7 @@
               <w:rPr>
                 <w:rFonts w:asciiTheme="minorHAnsi" w:eastAsiaTheme="minorHAnsi" w:hAnsiTheme="minorHAnsi"/>
               </w:rPr>
-              <w:t>代表者役職</w:t>
+              <w:t>表者役職</w:t>
             </w:r>
           </w:p>
         </w:tc>
@@ -3669,14 +3669,9 @@
               <w:jc w:val="right"/>
               <w:rPr>
                 <w:rFonts w:asciiTheme="minorHAnsi" w:eastAsiaTheme="minorHAnsi" w:hAnsiTheme="minorHAnsi"/>
-              </w:rPr>
-            </w:pPr>
-            <w:r>
-              <w:rPr>
-                <w:rFonts w:asciiTheme="minorHAnsi" w:eastAsiaTheme="minorHAnsi" w:hAnsiTheme="minorHAnsi"/>
-              </w:rPr>
-              <w:t xml:space="preserve">　</w:t>
-            </w:r>
+                <w:lang w:val="en-US"/>
+              </w:rPr>
+            </w:pPr>
             <w:r>
               <w:rPr>
                 <w:rFonts w:asciiTheme="minorHAnsi" w:eastAsiaTheme="minorHAnsi" w:hAnsiTheme="minorHAnsi"/>
@@ -3688,6 +3683,7 @@
             <w:r>
               <w:rPr>
                 <w:rFonts w:asciiTheme="minorHAnsi" w:eastAsiaTheme="minorHAnsi" w:hAnsiTheme="minorHAnsi"/>
+                <w:lang w:val="en-US"/>
               </w:rPr>
               <w:t>代表者役職</w:t>
             </w:r>
@@ -3697,13 +3693,7 @@
                 <w:b/>
                 <w:bCs/>
               </w:rPr>
-              <w:t xml:space="preserve"> }</w:t>
-            </w:r>
-            <w:r>
-              <w:rPr>
-                <w:rFonts w:asciiTheme="minorHAnsi" w:eastAsiaTheme="minorHAnsi" w:hAnsiTheme="minorHAnsi"/>
-              </w:rPr>
-              <w:t xml:space="preserve">　</w:t>
+              <w:t>}</w:t>
             </w:r>
           </w:p>
         </w:tc>
@@ -3777,7 +3767,7 @@
       <w:pPr>
         <w:ind w:right="840"/>
         <w:rPr>
-          <w:rFonts w:asciiTheme="minorHAnsi" w:eastAsiaTheme="minorHAnsi" w:hAnsiTheme="minorHAnsi" w:hint="eastAsia"/>
+          <w:rFonts w:asciiTheme="minorHAnsi" w:eastAsiaTheme="minorHAnsi" w:hAnsiTheme="minorHAnsi"/>
         </w:rPr>
       </w:pPr>
       <w:r>
@@ -3973,14 +3963,14 @@
         <w:tblLook w:val="0400" w:firstRow="0" w:lastRow="0" w:firstColumn="0" w:lastColumn="0" w:noHBand="0" w:noVBand="1"/>
       </w:tblPr>
       <w:tblGrid>
-        <w:gridCol w:w="3085"/>
-        <w:gridCol w:w="2977"/>
+        <w:gridCol w:w="3229"/>
+        <w:gridCol w:w="2833"/>
         <w:gridCol w:w="3224"/>
       </w:tblGrid>
       <w:tr>
         <w:tc>
           <w:tcPr>
-            <w:tcW w:w="3085" w:type="dxa"/>
+            <w:tcW w:w="3229" w:type="dxa"/>
             <w:tcBorders>
               <w:right w:val="single" w:sz="4" w:space="0" w:color="000000"/>
             </w:tcBorders>
@@ -4002,7 +3992,7 @@
         </w:tc>
         <w:tc>
           <w:tcPr>
-            <w:tcW w:w="2977" w:type="dxa"/>
+            <w:tcW w:w="2833" w:type="dxa"/>
             <w:tcBorders>
               <w:top w:val="single" w:sz="4" w:space="0" w:color="000000"/>
               <w:left w:val="single" w:sz="4" w:space="0" w:color="000000"/>
@@ -4052,7 +4042,7 @@
       <w:tr>
         <w:tc>
           <w:tcPr>
-            <w:tcW w:w="3085" w:type="dxa"/>
+            <w:tcW w:w="3229" w:type="dxa"/>
             <w:tcBorders>
               <w:right w:val="single" w:sz="12" w:space="0" w:color="000000"/>
             </w:tcBorders>
@@ -4074,7 +4064,7 @@
         </w:tc>
         <w:tc>
           <w:tcPr>
-            <w:tcW w:w="2977" w:type="dxa"/>
+            <w:tcW w:w="2833" w:type="dxa"/>
             <w:tcBorders>
               <w:top w:val="single" w:sz="12" w:space="0" w:color="000000"/>
               <w:left w:val="single" w:sz="12" w:space="0" w:color="000000"/>
@@ -4131,7 +4121,7 @@
       <w:tr>
         <w:tc>
           <w:tcPr>
-            <w:tcW w:w="3085" w:type="dxa"/>
+            <w:tcW w:w="3229" w:type="dxa"/>
             <w:tcBorders>
               <w:right w:val="single" w:sz="12" w:space="0" w:color="000000"/>
             </w:tcBorders>
@@ -4147,7 +4137,7 @@
         </w:tc>
         <w:tc>
           <w:tcPr>
-            <w:tcW w:w="2977" w:type="dxa"/>
+            <w:tcW w:w="2833" w:type="dxa"/>
             <w:tcBorders>
               <w:top w:val="single" w:sz="12" w:space="0" w:color="000000"/>
               <w:left w:val="single" w:sz="12" w:space="0" w:color="000000"/>
@@ -4729,33 +4719,15 @@
             </w:pPr>
             <w:r>
               <w:rPr>
-                <w:rFonts w:asciiTheme="minorEastAsia" w:hAnsiTheme="minorEastAsia"/>
-              </w:rPr>
-              <w:t>${</w:t>
-            </w:r>
-            <w:r>
-              <w:rPr>
                 <w:rFonts w:asciiTheme="minorEastAsia" w:hAnsiTheme="minorEastAsia" w:hint="eastAsia"/>
               </w:rPr>
-              <w:t>f</w:t>
-            </w:r>
-            <w:r>
-              <w:rPr>
-                <w:rFonts w:asciiTheme="minorEastAsia" w:hAnsiTheme="minorEastAsia" w:hint="eastAsia"/>
-              </w:rPr>
-              <w:t>7</w:t>
-            </w:r>
-            <w:r>
-              <w:rPr>
-                <w:rFonts w:asciiTheme="minorEastAsia" w:hAnsiTheme="minorEastAsia" w:hint="eastAsia"/>
-              </w:rPr>
-              <w:t>}</w:t>
-            </w:r>
-            <w:r>
-              <w:rPr>
-                <w:rFonts w:asciiTheme="minorEastAsia" w:hAnsiTheme="minorEastAsia"/>
-              </w:rPr>
-              <w:t xml:space="preserve"> 　　台</w:t>
+              <w:t>1</w:t>
+            </w:r>
+            <w:r>
+              <w:rPr>
+                <w:rFonts w:asciiTheme="minorEastAsia" w:hAnsiTheme="minorEastAsia"/>
+              </w:rPr>
+              <w:t xml:space="preserve">　台</w:t>
             </w:r>
           </w:p>
         </w:tc>
@@ -5452,7 +5424,7 @@
               <w:rPr>
                 <w:rFonts w:asciiTheme="minorEastAsia" w:hAnsiTheme="minorEastAsia"/>
               </w:rPr>
-              <w:t xml:space="preserve">　　kW</w:t>
+              <w:t>kW</w:t>
             </w:r>
           </w:p>
         </w:tc>
@@ -6054,6 +6026,7 @@
         <w:rPr>
           <w:rFonts w:asciiTheme="minorEastAsia" w:hAnsiTheme="minorEastAsia"/>
         </w:rPr>
+        <w:lastRenderedPageBreak/>
         <w:t>添付資料チェック欄</w:t>
       </w:r>
     </w:p>
@@ -8993,7 +8966,7 @@
 </file>
 
 <file path=word/endnotes.xml><?xml version="1.0" encoding="utf-8"?>
-<w:endnotes xmlns:wpc="http://schemas.microsoft.com/office/word/2010/wordprocessingCanvas" xmlns:cx="http://schemas.microsoft.com/office/drawing/2014/chartex" xmlns:cx1="http://schemas.microsoft.com/office/drawing/2015/9/8/chartex" xmlns:cx2="http://schemas.microsoft.com/office/drawing/2015/10/21/chartex" xmlns:cx3="http://schemas.microsoft.com/office/drawing/2016/5/9/chartex" xmlns:cx4="http://schemas.microsoft.com/office/drawing/2016/5/10/chartex" xmlns:cx5="http://schemas.microsoft.com/office/drawing/2016/5/11/chartex" xmlns:cx6="http://schemas.microsoft.com/office/drawing/2016/5/12/chartex" xmlns:cx7="http://schemas.microsoft.com/office/drawing/2016/5/13/chartex" xmlns:cx8="http://schemas.microsoft.com/office/drawing/2016/5/14/chartex" xmlns:mc="http://schemas.openxmlformats.org/markup-compatibility/2006" xmlns:aink="http://schemas.microsoft.com/office/drawing/2016/ink" xmlns:am3d="http://schemas.microsoft.com/office/drawing/2017/model3d" xmlns:o="urn:schemas-microsoft-com:office:office" xmlns:oel="http://schemas.microsoft.com/office/2019/extlst" xmlns:r="http://schemas.openxmlformats.org/officeDocument/2006/relationships" xmlns:m="http://schemas.openxmlformats.org/officeDocument/2006/math" xmlns:v="urn:schemas-microsoft-com:vml" xmlns:wp14="http://schemas.microsoft.com/office/word/2010/wordprocessingDrawing" xmlns:wp="http://schemas.openxmlformats.org/drawingml/2006/wordprocessingDrawing" xmlns:w10="urn:schemas-microsoft-com:office:word" xmlns:w="http://schemas.openxmlformats.org/wordprocessingml/2006/main" xmlns:w14="http://schemas.microsoft.com/office/word/2010/wordml" xmlns:w15="http://schemas.microsoft.com/office/word/2012/wordml" xmlns:w16cei="http://schemas.microsoft.com/office/word/2026/wordml/cei" xmlns:w16cex="http://schemas.microsoft.com/office/word/2018/wordml/cex" xmlns:w16cid="http://schemas.microsoft.com/office/word/2016/wordml/cid" xmlns:w16="http://schemas.microsoft.com/office/word/2018/wordml" xmlns:w16du="http://schemas.microsoft.com/office/word/2023/wordml/word16du" xmlns:w16sdtdh="http://schemas.microsoft.com/office/word/2020/wordml/sdtdatahash" xmlns:w16sdtfl="http://schemas.microsoft.com/office/word/2024/wordml/sdtformatlock" xmlns:w16se="http://schemas.microsoft.com/office/word/2015/wordml/symex" xmlns:wpg="http://schemas.microsoft.com/office/word/2010/wordprocessingGroup" xmlns:wpi="http://schemas.microsoft.com/office/word/2010/wordprocessingInk" xmlns:wne="http://schemas.microsoft.com/office/word/2006/wordml" xmlns:wps="http://schemas.microsoft.com/office/word/2010/wordprocessingShape" mc:Ignorable="w14 w15 w16se w16cid w16 w16cex w16sdtdh w16sdtfl w16du wp14">
+<w:endnotes xmlns:wpc="http://schemas.microsoft.com/office/word/2010/wordprocessingCanvas" xmlns:cx="http://schemas.microsoft.com/office/drawing/2014/chartex" xmlns:cx1="http://schemas.microsoft.com/office/drawing/2015/9/8/chartex" xmlns:cx2="http://schemas.microsoft.com/office/drawing/2015/10/21/chartex" xmlns:cx3="http://schemas.microsoft.com/office/drawing/2016/5/9/chartex" xmlns:cx4="http://schemas.microsoft.com/office/drawing/2016/5/10/chartex" xmlns:cx5="http://schemas.microsoft.com/office/drawing/2016/5/11/chartex" xmlns:cx6="http://schemas.microsoft.com/office/drawing/2016/5/12/chartex" xmlns:cx7="http://schemas.microsoft.com/office/drawing/2016/5/13/chartex" xmlns:cx8="http://schemas.microsoft.com/office/drawing/2016/5/14/chartex" xmlns:mc="http://schemas.openxmlformats.org/markup-compatibility/2006" xmlns:aink="http://schemas.microsoft.com/office/drawing/2016/ink" xmlns:am3d="http://schemas.microsoft.com/office/drawing/2017/model3d" xmlns:o="urn:schemas-microsoft-com:office:office" xmlns:oel="http://schemas.microsoft.com/office/2019/extlst" xmlns:r="http://schemas.openxmlformats.org/officeDocument/2006/relationships" xmlns:m="http://schemas.openxmlformats.org/officeDocument/2006/math" xmlns:v="urn:schemas-microsoft-com:vml" xmlns:wp14="http://schemas.microsoft.com/office/word/2010/wordprocessingDrawing" xmlns:wp="http://schemas.openxmlformats.org/drawingml/2006/wordprocessingDrawing" xmlns:w10="urn:schemas-microsoft-com:office:word" xmlns:w="http://schemas.openxmlformats.org/wordprocessingml/2006/main" xmlns:w14="http://schemas.microsoft.com/office/word/2010/wordml" xmlns:w15="http://schemas.microsoft.com/office/word/2012/wordml" xmlns:w16cex="http://schemas.microsoft.com/office/word/2018/wordml/cex" xmlns:w16cid="http://schemas.microsoft.com/office/word/2016/wordml/cid" xmlns:w16="http://schemas.microsoft.com/office/word/2018/wordml" xmlns:w16du="http://schemas.microsoft.com/office/word/2023/wordml/word16du" xmlns:w16sdtdh="http://schemas.microsoft.com/office/word/2020/wordml/sdtdatahash" xmlns:w16sdtfl="http://schemas.microsoft.com/office/word/2024/wordml/sdtformatlock" xmlns:w16se="http://schemas.microsoft.com/office/word/2015/wordml/symex" xmlns:wpg="http://schemas.microsoft.com/office/word/2010/wordprocessingGroup" xmlns:wpi="http://schemas.microsoft.com/office/word/2010/wordprocessingInk" xmlns:wne="http://schemas.microsoft.com/office/word/2006/wordml" xmlns:wps="http://schemas.microsoft.com/office/word/2010/wordprocessingShape" mc:Ignorable="w14 w15 w16se w16cid w16 w16cex w16sdtdh w16sdtfl w16du wp14">
   <w:endnote w:type="separator" w:id="-1">
     <w:p>
       <w:r>
@@ -9012,7 +8985,7 @@
 </file>
 
 <file path=word/footer1.xml><?xml version="1.0" encoding="utf-8"?>
-<w:ftr xmlns:wpc="http://schemas.microsoft.com/office/word/2010/wordprocessingCanvas" xmlns:cx="http://schemas.microsoft.com/office/drawing/2014/chartex" xmlns:cx1="http://schemas.microsoft.com/office/drawing/2015/9/8/chartex" xmlns:cx2="http://schemas.microsoft.com/office/drawing/2015/10/21/chartex" xmlns:cx3="http://schemas.microsoft.com/office/drawing/2016/5/9/chartex" xmlns:cx4="http://schemas.microsoft.com/office/drawing/2016/5/10/chartex" xmlns:cx5="http://schemas.microsoft.com/office/drawing/2016/5/11/chartex" xmlns:cx6="http://schemas.microsoft.com/office/drawing/2016/5/12/chartex" xmlns:cx7="http://schemas.microsoft.com/office/drawing/2016/5/13/chartex" xmlns:cx8="http://schemas.microsoft.com/office/drawing/2016/5/14/chartex" xmlns:mc="http://schemas.openxmlformats.org/markup-compatibility/2006" xmlns:aink="http://schemas.microsoft.com/office/drawing/2016/ink" xmlns:am3d="http://schemas.microsoft.com/office/drawing/2017/model3d" xmlns:o="urn:schemas-microsoft-com:office:office" xmlns:oel="http://schemas.microsoft.com/office/2019/extlst" xmlns:r="http://schemas.openxmlformats.org/officeDocument/2006/relationships" xmlns:m="http://schemas.openxmlformats.org/officeDocument/2006/math" xmlns:v="urn:schemas-microsoft-com:vml" xmlns:wp14="http://schemas.microsoft.com/office/word/2010/wordprocessingDrawing" xmlns:wp="http://schemas.openxmlformats.org/drawingml/2006/wordprocessingDrawing" xmlns:w10="urn:schemas-microsoft-com:office:word" xmlns:w="http://schemas.openxmlformats.org/wordprocessingml/2006/main" xmlns:w14="http://schemas.microsoft.com/office/word/2010/wordml" xmlns:w15="http://schemas.microsoft.com/office/word/2012/wordml" xmlns:w16cei="http://schemas.microsoft.com/office/word/2026/wordml/cei" xmlns:w16cex="http://schemas.microsoft.com/office/word/2018/wordml/cex" xmlns:w16cid="http://schemas.microsoft.com/office/word/2016/wordml/cid" xmlns:w16="http://schemas.microsoft.com/office/word/2018/wordml" xmlns:w16du="http://schemas.microsoft.com/office/word/2023/wordml/word16du" xmlns:w16sdtdh="http://schemas.microsoft.com/office/word/2020/wordml/sdtdatahash" xmlns:w16sdtfl="http://schemas.microsoft.com/office/word/2024/wordml/sdtformatlock" xmlns:w16se="http://schemas.microsoft.com/office/word/2015/wordml/symex" xmlns:wpg="http://schemas.microsoft.com/office/word/2010/wordprocessingGroup" xmlns:wpi="http://schemas.microsoft.com/office/word/2010/wordprocessingInk" xmlns:wne="http://schemas.microsoft.com/office/word/2006/wordml" xmlns:wps="http://schemas.microsoft.com/office/word/2010/wordprocessingShape" mc:Ignorable="w14 w15 w16se w16cid w16 w16cex w16sdtdh w16sdtfl w16du wp14">
+<w:ftr xmlns:wpc="http://schemas.microsoft.com/office/word/2010/wordprocessingCanvas" xmlns:cx="http://schemas.microsoft.com/office/drawing/2014/chartex" xmlns:cx1="http://schemas.microsoft.com/office/drawing/2015/9/8/chartex" xmlns:cx2="http://schemas.microsoft.com/office/drawing/2015/10/21/chartex" xmlns:cx3="http://schemas.microsoft.com/office/drawing/2016/5/9/chartex" xmlns:cx4="http://schemas.microsoft.com/office/drawing/2016/5/10/chartex" xmlns:cx5="http://schemas.microsoft.com/office/drawing/2016/5/11/chartex" xmlns:cx6="http://schemas.microsoft.com/office/drawing/2016/5/12/chartex" xmlns:cx7="http://schemas.microsoft.com/office/drawing/2016/5/13/chartex" xmlns:cx8="http://schemas.microsoft.com/office/drawing/2016/5/14/chartex" xmlns:mc="http://schemas.openxmlformats.org/markup-compatibility/2006" xmlns:aink="http://schemas.microsoft.com/office/drawing/2016/ink" xmlns:am3d="http://schemas.microsoft.com/office/drawing/2017/model3d" xmlns:o="urn:schemas-microsoft-com:office:office" xmlns:oel="http://schemas.microsoft.com/office/2019/extlst" xmlns:r="http://schemas.openxmlformats.org/officeDocument/2006/relationships" xmlns:m="http://schemas.openxmlformats.org/officeDocument/2006/math" xmlns:v="urn:schemas-microsoft-com:vml" xmlns:wp14="http://schemas.microsoft.com/office/word/2010/wordprocessingDrawing" xmlns:wp="http://schemas.openxmlformats.org/drawingml/2006/wordprocessingDrawing" xmlns:w10="urn:schemas-microsoft-com:office:word" xmlns:w="http://schemas.openxmlformats.org/wordprocessingml/2006/main" xmlns:w14="http://schemas.microsoft.com/office/word/2010/wordml" xmlns:w15="http://schemas.microsoft.com/office/word/2012/wordml" xmlns:w16cex="http://schemas.microsoft.com/office/word/2018/wordml/cex" xmlns:w16cid="http://schemas.microsoft.com/office/word/2016/wordml/cid" xmlns:w16="http://schemas.microsoft.com/office/word/2018/wordml" xmlns:w16du="http://schemas.microsoft.com/office/word/2023/wordml/word16du" xmlns:w16sdtdh="http://schemas.microsoft.com/office/word/2020/wordml/sdtdatahash" xmlns:w16sdtfl="http://schemas.microsoft.com/office/word/2024/wordml/sdtformatlock" xmlns:w16se="http://schemas.microsoft.com/office/word/2015/wordml/symex" xmlns:wpg="http://schemas.microsoft.com/office/word/2010/wordprocessingGroup" xmlns:wpi="http://schemas.microsoft.com/office/word/2010/wordprocessingInk" xmlns:wne="http://schemas.microsoft.com/office/word/2006/wordml" xmlns:wps="http://schemas.microsoft.com/office/word/2010/wordprocessingShape" mc:Ignorable="w14 w15 w16se w16cid w16 w16cex w16sdtdh w16sdtfl w16du wp14">
   <w:p>
     <w:pPr>
       <w:pBdr>
@@ -9087,7 +9060,7 @@
 </file>
 
 <file path=word/footnotes.xml><?xml version="1.0" encoding="utf-8"?>
-<w:footnotes xmlns:wpc="http://schemas.microsoft.com/office/word/2010/wordprocessingCanvas" xmlns:cx="http://schemas.microsoft.com/office/drawing/2014/chartex" xmlns:cx1="http://schemas.microsoft.com/office/drawing/2015/9/8/chartex" xmlns:cx2="http://schemas.microsoft.com/office/drawing/2015/10/21/chartex" xmlns:cx3="http://schemas.microsoft.com/office/drawing/2016/5/9/chartex" xmlns:cx4="http://schemas.microsoft.com/office/drawing/2016/5/10/chartex" xmlns:cx5="http://schemas.microsoft.com/office/drawing/2016/5/11/chartex" xmlns:cx6="http://schemas.microsoft.com/office/drawing/2016/5/12/chartex" xmlns:cx7="http://schemas.microsoft.com/office/drawing/2016/5/13/chartex" xmlns:cx8="http://schemas.microsoft.com/office/drawing/2016/5/14/chartex" xmlns:mc="http://schemas.openxmlformats.org/markup-compatibility/2006" xmlns:aink="http://schemas.microsoft.com/office/drawing/2016/ink" xmlns:am3d="http://schemas.microsoft.com/office/drawing/2017/model3d" xmlns:o="urn:schemas-microsoft-com:office:office" xmlns:oel="http://schemas.microsoft.com/office/2019/extlst" xmlns:r="http://schemas.openxmlformats.org/officeDocument/2006/relationships" xmlns:m="http://schemas.openxmlformats.org/officeDocument/2006/math" xmlns:v="urn:schemas-microsoft-com:vml" xmlns:wp14="http://schemas.microsoft.com/office/word/2010/wordprocessingDrawing" xmlns:wp="http://schemas.openxmlformats.org/drawingml/2006/wordprocessingDrawing" xmlns:w10="urn:schemas-microsoft-com:office:word" xmlns:w="http://schemas.openxmlformats.org/wordprocessingml/2006/main" xmlns:w14="http://schemas.microsoft.com/office/word/2010/wordml" xmlns:w15="http://schemas.microsoft.com/office/word/2012/wordml" xmlns:w16cei="http://schemas.microsoft.com/office/word/2026/wordml/cei" xmlns:w16cex="http://schemas.microsoft.com/office/word/2018/wordml/cex" xmlns:w16cid="http://schemas.microsoft.com/office/word/2016/wordml/cid" xmlns:w16="http://schemas.microsoft.com/office/word/2018/wordml" xmlns:w16du="http://schemas.microsoft.com/office/word/2023/wordml/word16du" xmlns:w16sdtdh="http://schemas.microsoft.com/office/word/2020/wordml/sdtdatahash" xmlns:w16sdtfl="http://schemas.microsoft.com/office/word/2024/wordml/sdtformatlock" xmlns:w16se="http://schemas.microsoft.com/office/word/2015/wordml/symex" xmlns:wpg="http://schemas.microsoft.com/office/word/2010/wordprocessingGroup" xmlns:wpi="http://schemas.microsoft.com/office/word/2010/wordprocessingInk" xmlns:wne="http://schemas.microsoft.com/office/word/2006/wordml" xmlns:wps="http://schemas.microsoft.com/office/word/2010/wordprocessingShape" mc:Ignorable="w14 w15 w16se w16cid w16 w16cex w16sdtdh w16sdtfl w16du wp14">
+<w:footnotes xmlns:wpc="http://schemas.microsoft.com/office/word/2010/wordprocessingCanvas" xmlns:cx="http://schemas.microsoft.com/office/drawing/2014/chartex" xmlns:cx1="http://schemas.microsoft.com/office/drawing/2015/9/8/chartex" xmlns:cx2="http://schemas.microsoft.com/office/drawing/2015/10/21/chartex" xmlns:cx3="http://schemas.microsoft.com/office/drawing/2016/5/9/chartex" xmlns:cx4="http://schemas.microsoft.com/office/drawing/2016/5/10/chartex" xmlns:cx5="http://schemas.microsoft.com/office/drawing/2016/5/11/chartex" xmlns:cx6="http://schemas.microsoft.com/office/drawing/2016/5/12/chartex" xmlns:cx7="http://schemas.microsoft.com/office/drawing/2016/5/13/chartex" xmlns:cx8="http://schemas.microsoft.com/office/drawing/2016/5/14/chartex" xmlns:mc="http://schemas.openxmlformats.org/markup-compatibility/2006" xmlns:aink="http://schemas.microsoft.com/office/drawing/2016/ink" xmlns:am3d="http://schemas.microsoft.com/office/drawing/2017/model3d" xmlns:o="urn:schemas-microsoft-com:office:office" xmlns:oel="http://schemas.microsoft.com/office/2019/extlst" xmlns:r="http://schemas.openxmlformats.org/officeDocument/2006/relationships" xmlns:m="http://schemas.openxmlformats.org/officeDocument/2006/math" xmlns:v="urn:schemas-microsoft-com:vml" xmlns:wp14="http://schemas.microsoft.com/office/word/2010/wordprocessingDrawing" xmlns:wp="http://schemas.openxmlformats.org/drawingml/2006/wordprocessingDrawing" xmlns:w10="urn:schemas-microsoft-com:office:word" xmlns:w="http://schemas.openxmlformats.org/wordprocessingml/2006/main" xmlns:w14="http://schemas.microsoft.com/office/word/2010/wordml" xmlns:w15="http://schemas.microsoft.com/office/word/2012/wordml" xmlns:w16cex="http://schemas.microsoft.com/office/word/2018/wordml/cex" xmlns:w16cid="http://schemas.microsoft.com/office/word/2016/wordml/cid" xmlns:w16="http://schemas.microsoft.com/office/word/2018/wordml" xmlns:w16du="http://schemas.microsoft.com/office/word/2023/wordml/word16du" xmlns:w16sdtdh="http://schemas.microsoft.com/office/word/2020/wordml/sdtdatahash" xmlns:w16sdtfl="http://schemas.microsoft.com/office/word/2024/wordml/sdtformatlock" xmlns:w16se="http://schemas.microsoft.com/office/word/2015/wordml/symex" xmlns:wpg="http://schemas.microsoft.com/office/word/2010/wordprocessingGroup" xmlns:wpi="http://schemas.microsoft.com/office/word/2010/wordprocessingInk" xmlns:wne="http://schemas.microsoft.com/office/word/2006/wordml" xmlns:wps="http://schemas.microsoft.com/office/word/2010/wordprocessingShape" mc:Ignorable="w14 w15 w16se w16cid w16 w16cex w16sdtdh w16sdtfl w16du wp14">
   <w:footnote w:type="separator" w:id="-1">
     <w:p>
       <w:r>
@@ -9106,7 +9079,7 @@
 </file>
 
 <file path=word/numbering.xml><?xml version="1.0" encoding="utf-8"?>
-<w:numbering xmlns:wpc="http://schemas.microsoft.com/office/word/2010/wordprocessingCanvas" xmlns:cx="http://schemas.microsoft.com/office/drawing/2014/chartex" xmlns:cx1="http://schemas.microsoft.com/office/drawing/2015/9/8/chartex" xmlns:cx2="http://schemas.microsoft.com/office/drawing/2015/10/21/chartex" xmlns:cx3="http://schemas.microsoft.com/office/drawing/2016/5/9/chartex" xmlns:cx4="http://schemas.microsoft.com/office/drawing/2016/5/10/chartex" xmlns:cx5="http://schemas.microsoft.com/office/drawing/2016/5/11/chartex" xmlns:cx6="http://schemas.microsoft.com/office/drawing/2016/5/12/chartex" xmlns:cx7="http://schemas.microsoft.com/office/drawing/2016/5/13/chartex" xmlns:cx8="http://schemas.microsoft.com/office/drawing/2016/5/14/chartex" xmlns:mc="http://schemas.openxmlformats.org/markup-compatibility/2006" xmlns:aink="http://schemas.microsoft.com/office/drawing/2016/ink" xmlns:am3d="http://schemas.microsoft.com/office/drawing/2017/model3d" xmlns:o="urn:schemas-microsoft-com:office:office" xmlns:oel="http://schemas.microsoft.com/office/2019/extlst" xmlns:r="http://schemas.openxmlformats.org/officeDocument/2006/relationships" xmlns:m="http://schemas.openxmlformats.org/officeDocument/2006/math" xmlns:v="urn:schemas-microsoft-com:vml" xmlns:wp14="http://schemas.microsoft.com/office/word/2010/wordprocessingDrawing" xmlns:wp="http://schemas.openxmlformats.org/drawingml/2006/wordprocessingDrawing" xmlns:w10="urn:schemas-microsoft-com:office:word" xmlns:w="http://schemas.openxmlformats.org/wordprocessingml/2006/main" xmlns:w14="http://schemas.microsoft.com/office/word/2010/wordml" xmlns:w15="http://schemas.microsoft.com/office/word/2012/wordml" xmlns:w16cei="http://schemas.microsoft.com/office/word/2026/wordml/cei" xmlns:w16cex="http://schemas.microsoft.com/office/word/2018/wordml/cex" xmlns:w16cid="http://schemas.microsoft.com/office/word/2016/wordml/cid" xmlns:w16="http://schemas.microsoft.com/office/word/2018/wordml" xmlns:w16du="http://schemas.microsoft.com/office/word/2023/wordml/word16du" xmlns:w16sdtdh="http://schemas.microsoft.com/office/word/2020/wordml/sdtdatahash" xmlns:w16sdtfl="http://schemas.microsoft.com/office/word/2024/wordml/sdtformatlock" xmlns:w16se="http://schemas.microsoft.com/office/word/2015/wordml/symex" xmlns:wpg="http://schemas.microsoft.com/office/word/2010/wordprocessingGroup" xmlns:wpi="http://schemas.microsoft.com/office/word/2010/wordprocessingInk" xmlns:wne="http://schemas.microsoft.com/office/word/2006/wordml" xmlns:wps="http://schemas.microsoft.com/office/word/2010/wordprocessingShape" mc:Ignorable="w14 w15 w16se w16cid w16 w16cex w16sdtdh w16sdtfl w16du wp14">
+<w:numbering xmlns:wpc="http://schemas.microsoft.com/office/word/2010/wordprocessingCanvas" xmlns:cx="http://schemas.microsoft.com/office/drawing/2014/chartex" xmlns:cx1="http://schemas.microsoft.com/office/drawing/2015/9/8/chartex" xmlns:cx2="http://schemas.microsoft.com/office/drawing/2015/10/21/chartex" xmlns:cx3="http://schemas.microsoft.com/office/drawing/2016/5/9/chartex" xmlns:cx4="http://schemas.microsoft.com/office/drawing/2016/5/10/chartex" xmlns:cx5="http://schemas.microsoft.com/office/drawing/2016/5/11/chartex" xmlns:cx6="http://schemas.microsoft.com/office/drawing/2016/5/12/chartex" xmlns:cx7="http://schemas.microsoft.com/office/drawing/2016/5/13/chartex" xmlns:cx8="http://schemas.microsoft.com/office/drawing/2016/5/14/chartex" xmlns:mc="http://schemas.openxmlformats.org/markup-compatibility/2006" xmlns:aink="http://schemas.microsoft.com/office/drawing/2016/ink" xmlns:am3d="http://schemas.microsoft.com/office/drawing/2017/model3d" xmlns:o="urn:schemas-microsoft-com:office:office" xmlns:oel="http://schemas.microsoft.com/office/2019/extlst" xmlns:r="http://schemas.openxmlformats.org/officeDocument/2006/relationships" xmlns:m="http://schemas.openxmlformats.org/officeDocument/2006/math" xmlns:v="urn:schemas-microsoft-com:vml" xmlns:wp14="http://schemas.microsoft.com/office/word/2010/wordprocessingDrawing" xmlns:wp="http://schemas.openxmlformats.org/drawingml/2006/wordprocessingDrawing" xmlns:w10="urn:schemas-microsoft-com:office:word" xmlns:w="http://schemas.openxmlformats.org/wordprocessingml/2006/main" xmlns:w14="http://schemas.microsoft.com/office/word/2010/wordml" xmlns:w15="http://schemas.microsoft.com/office/word/2012/wordml" xmlns:w16cex="http://schemas.microsoft.com/office/word/2018/wordml/cex" xmlns:w16cid="http://schemas.microsoft.com/office/word/2016/wordml/cid" xmlns:w16="http://schemas.microsoft.com/office/word/2018/wordml" xmlns:w16du="http://schemas.microsoft.com/office/word/2023/wordml/word16du" xmlns:w16sdtdh="http://schemas.microsoft.com/office/word/2020/wordml/sdtdatahash" xmlns:w16sdtfl="http://schemas.microsoft.com/office/word/2024/wordml/sdtformatlock" xmlns:w16se="http://schemas.microsoft.com/office/word/2015/wordml/symex" xmlns:wpg="http://schemas.microsoft.com/office/word/2010/wordprocessingGroup" xmlns:wpi="http://schemas.microsoft.com/office/word/2010/wordprocessingInk" xmlns:wne="http://schemas.microsoft.com/office/word/2006/wordml" xmlns:wps="http://schemas.microsoft.com/office/word/2010/wordprocessingShape" mc:Ignorable="w14 w15 w16se w16cid w16 w16cex w16sdtdh w16sdtfl w16du wp14">
   <w:abstractNum w:abstractNumId="0" w15:restartNumberingAfterBreak="0">
     <w:nsid w:val="14C15382"/>
     <w:multiLevelType w:val="multilevel"/>
@@ -11013,6 +10986,19 @@
       </w:tblCellMar>
     </w:tblPr>
   </w:style>
+  <w:style w:type="paragraph" w:styleId="Web">
+    <w:name w:val="Normal (Web)"/>
+    <w:basedOn w:val="a"/>
+    <w:uiPriority w:val="99"/>
+    <w:semiHidden/>
+    <w:unhideWhenUsed/>
+    <w:rsid w:val="00E21101"/>
+    <w:rPr>
+      <w:rFonts w:ascii="Times New Roman" w:hAnsi="Times New Roman" w:cs="Times New Roman"/>
+      <w:sz w:val="24"/>
+      <w:szCs w:val="24"/>
+    </w:rPr>
+  </w:style>
 </w:styles>
 </file>
 
@@ -11312,28 +11298,28 @@
 </file>
 
 <file path=customXml/item1.xml><?xml version="1.0" encoding="utf-8"?>
+<b:Sources xmlns:b="http://schemas.openxmlformats.org/officeDocument/2006/bibliography" xmlns="http://schemas.openxmlformats.org/officeDocument/2006/bibliography" SelectedStyle="\APASixthEditionOfficeOnline.xsl" StyleName="APA" Version="6"/>
+</file>
+
+<file path=customXml/item2.xml><?xml version="1.0" encoding="utf-8"?>
 <go:gDocsCustomXmlDataStorage xmlns:go="http://customooxmlschemas.google.com/" xmlns:r="http://schemas.openxmlformats.org/officeDocument/2006/relationships" uri="GoogleDocsCustomDataVersion2">
   <go:docsCustomData xmlns:go="http://customooxmlschemas.google.com/" roundtripDataSignature="AMtx7mhfYdXSGu0zy+MuQk6rjb/Y5MyolQ==">CgMxLjAyDmguNmJ3cnNhMnV1eW1vMg5oLmxzOGxuNGg1azk3djIOaC5odDI2Zm42cWNkdzkyDmgud28ya3FvaWJ5ZG4xMg5oLnQ5d3ByYWxqNGhrNDIOaC5xZnE4am9yY2ZjdGI4AHIhMTYydHZ3UU5VV2ZWYjlSX2VnRVM4bWZIT2ZOa3pmM3lU</go:docsCustomData>
 </go:gDocsCustomXmlDataStorage>
 </file>
 
-<file path=customXml/item2.xml><?xml version="1.0" encoding="utf-8"?>
-<b:Sources xmlns:b="http://schemas.openxmlformats.org/officeDocument/2006/bibliography" xmlns="http://schemas.openxmlformats.org/officeDocument/2006/bibliography" SelectedStyle="\APASixthEditionOfficeOnline.xsl" StyleName="APA" Version="6"/>
+<file path=customXml/itemProps1.xml><?xml version="1.0" encoding="utf-8"?>
+<ds:datastoreItem xmlns:ds="http://schemas.openxmlformats.org/officeDocument/2006/customXml" ds:itemID="{95B87605-462A-47AE-A027-51FD9584CDCD}">
+  <ds:schemaRefs>
+    <ds:schemaRef ds:uri="http://schemas.openxmlformats.org/officeDocument/2006/bibliography"/>
+  </ds:schemaRefs>
+</ds:datastoreItem>
 </file>
 
-<file path=customXml/itemProps1.xml><?xml version="1.0" encoding="utf-8"?>
+<file path=customXml/itemProps2.xml><?xml version="1.0" encoding="utf-8"?>
 <ds:datastoreItem xmlns:ds="http://schemas.openxmlformats.org/officeDocument/2006/customXml" ds:itemID="{11111111-1234-1234-1234-123412341234}">
   <ds:schemaRefs>
     <ds:schemaRef ds:uri="http://customooxmlschemas.google.com/"/>
     <ds:schemaRef ds:uri="http://schemas.openxmlformats.org/officeDocument/2006/relationships"/>
   </ds:schemaRefs>
 </ds:datastoreItem>
-</file>
-
-<file path=customXml/itemProps2.xml><?xml version="1.0" encoding="utf-8"?>
-<ds:datastoreItem xmlns:ds="http://schemas.openxmlformats.org/officeDocument/2006/customXml" ds:itemID="{95B87605-462A-47AE-A027-51FD9584CDCD}">
-  <ds:schemaRefs>
-    <ds:schemaRef ds:uri="http://schemas.openxmlformats.org/officeDocument/2006/bibliography"/>
-  </ds:schemaRefs>
-</ds:datastoreItem>
 </file>
</xml_diff>